<commit_message>
Add 1-page cheat sheet to Week1 DB revision notes
</commit_message>
<xml_diff>
--- a/School/DatabaseApplications/Notes/Week1_Revision_and_Preparatory_Work_Practice_Notes_ENZH.docx
+++ b/School/DatabaseApplications/Notes/Week1_Revision_and_Preparatory_Work_Practice_Notes_ENZH.docx
@@ -18,7 +18,7 @@
     </w:p>
     <w:p>
       <w:r>
-        <w:t>Generated: 2026-03-07 16:28 (local)</w:t>
+        <w:t>Generated: 2026-03-07 16:30 (local)</w:t>
       </w:r>
     </w:p>
     <w:p>
@@ -43,6 +43,228 @@
       </w:pPr>
       <w:r>
         <w:t>中文：每題先看目標（Goal），自己先寫SQL；再比對『你的版本』與『進階版本』，最後背口訣與陷阱。</w:t>
+      </w:r>
+    </w:p>
+    <w:p>
+      <w:pPr>
+        <w:pStyle w:val="Heading1"/>
+      </w:pPr>
+      <w:r>
+        <w:t>1-page Cheat Sheet（口訣＋模板）</w:t>
+      </w:r>
+    </w:p>
+    <w:p>
+      <w:r>
+        <w:t>Use these as templates. Copy → edit literals. / 直接複製套用再改條件。</w:t>
+      </w:r>
+    </w:p>
+    <w:p>
+      <w:r>
+        <w:t>Core rules / 核心規則：</w:t>
+      </w:r>
+    </w:p>
+    <w:p>
+      <w:pPr>
+        <w:pStyle w:val="ListBullet"/>
+      </w:pPr>
+      <w:r>
+        <w:t>COUNT(*): counts rows; COUNT(col): counts non-NULL values. / COUNT(*)算筆數；COUNT(欄位)忽略NULL。</w:t>
+      </w:r>
+    </w:p>
+    <w:p>
+      <w:pPr>
+        <w:pStyle w:val="ListBullet"/>
+      </w:pPr>
+      <w:r>
+        <w:t>AND &gt; OR precedence → always add parentheses. / AND 優先於 OR → 一律加括號。</w:t>
+      </w:r>
+    </w:p>
+    <w:p>
+      <w:pPr>
+        <w:pStyle w:val="ListBullet"/>
+      </w:pPr>
+      <w:r>
+        <w:t>LIKE '%x%': contains. / LIKE '%x%': 包含。</w:t>
+      </w:r>
+    </w:p>
+    <w:p>
+      <w:pPr>
+        <w:pStyle w:val="ListBullet"/>
+      </w:pPr>
+      <w:r>
+        <w:t>NULL check: IS NULL / IS NOT NULL (never = NULL). / NULL 用 IS NULL，不用 = NULL。</w:t>
+      </w:r>
+    </w:p>
+    <w:p>
+      <w:pPr>
+        <w:pStyle w:val="ListBullet"/>
+      </w:pPr>
+      <w:r>
+        <w:t>FULL LIST rule: the table you want fully listed must be on the LEFT of LEFT JOIN. / 要『全列誰』誰就放 LEFT JOIN 左邊。</w:t>
+      </w:r>
+    </w:p>
+    <w:p>
+      <w:pPr>
+        <w:pStyle w:val="ListBullet"/>
+      </w:pPr>
+      <w:r>
+        <w:t>Aggregates in filter → HAVING (not WHERE). / 有 SUM/AVG/COUNT 就想 HAVING。</w:t>
+      </w:r>
+    </w:p>
+    <w:p>
+      <w:r>
+        <w:t>Templates / 模板：</w:t>
+      </w:r>
+    </w:p>
+    <w:p>
+      <w:r>
+        <w:t>1) Filter + sort / 篩選＋排序</w:t>
+      </w:r>
+    </w:p>
+    <w:p>
+      <w:r>
+        <w:rPr>
+          <w:rFonts w:ascii="Consolas" w:hAnsi="Consolas"/>
+          <w:sz w:val="20"/>
+        </w:rPr>
+        <w:t>SELECT col1, col2</w:t>
+        <w:br/>
+        <w:t>FROM table</w:t>
+        <w:br/>
+        <w:t>WHERE condition</w:t>
+        <w:br/>
+        <w:t xml:space="preserve">ORDER BY col; </w:t>
+      </w:r>
+    </w:p>
+    <w:p>
+      <w:r>
+        <w:t>2) AND/OR with parentheses / AND/OR 括號</w:t>
+      </w:r>
+    </w:p>
+    <w:p>
+      <w:r>
+        <w:rPr>
+          <w:rFonts w:ascii="Consolas" w:hAnsi="Consolas"/>
+          <w:sz w:val="20"/>
+        </w:rPr>
+        <w:t>WHERE (condA AND condB) OR (condC)</w:t>
+      </w:r>
+    </w:p>
+    <w:p>
+      <w:r>
+        <w:t>3) MAX/MIN nested query / MAX/MIN 子查詢</w:t>
+      </w:r>
+    </w:p>
+    <w:p>
+      <w:r>
+        <w:rPr>
+          <w:rFonts w:ascii="Consolas" w:hAnsi="Consolas"/>
+          <w:sz w:val="20"/>
+        </w:rPr>
+        <w:t>SELECT MVTITLE, YRMDE</w:t>
+        <w:br/>
+        <w:t>FROM movie</w:t>
+        <w:br/>
+        <w:t>WHERE YRMDE = (SELECT MAX(YRMDE) FROM movie);</w:t>
+      </w:r>
+    </w:p>
+    <w:p>
+      <w:r>
+        <w:t>4) GROUP BY + HAVING / 分組＋HAVING</w:t>
+      </w:r>
+    </w:p>
+    <w:p>
+      <w:r>
+        <w:rPr>
+          <w:rFonts w:ascii="Consolas" w:hAnsi="Consolas"/>
+          <w:sz w:val="20"/>
+        </w:rPr>
+        <w:t>SELECT key, SUM(x) AS total</w:t>
+        <w:br/>
+        <w:t>FROM t</w:t>
+        <w:br/>
+        <w:t>GROUP BY key</w:t>
+        <w:br/>
+        <w:t>HAVING SUM(x) &gt; 0</w:t>
+        <w:br/>
+        <w:t>ORDER BY total DESC;</w:t>
+      </w:r>
+    </w:p>
+    <w:p>
+      <w:r>
+        <w:t>5) LEFT JOIN full list / 全列 LEFT JOIN</w:t>
+      </w:r>
+    </w:p>
+    <w:p>
+      <w:r>
+        <w:rPr>
+          <w:rFonts w:ascii="Consolas" w:hAnsi="Consolas"/>
+          <w:sz w:val="20"/>
+        </w:rPr>
+        <w:t>SELECT left.name, right.value</w:t>
+        <w:br/>
+        <w:t>FROM left</w:t>
+        <w:br/>
+        <w:t>LEFT JOIN right ON right.fk = left.pk;</w:t>
+      </w:r>
+    </w:p>
+    <w:p>
+      <w:r>
+        <w:t>6) Many-to-many bridge join / 多對多橋表</w:t>
+      </w:r>
+    </w:p>
+    <w:p>
+      <w:r>
+        <w:rPr>
+          <w:rFonts w:ascii="Consolas" w:hAnsi="Consolas"/>
+          <w:sz w:val="20"/>
+        </w:rPr>
+        <w:t>SELECT s.STARNAME</w:t>
+        <w:br/>
+        <w:t>FROM movie m</w:t>
+        <w:br/>
+        <w:t>JOIN movstar ms ON ms.MVNUMB = m.MVNUMB</w:t>
+        <w:br/>
+        <w:t>JOIN star s ON s.STARNUMB = ms.STARNUMB</w:t>
+        <w:br/>
+        <w:t>WHERE m.MVTITLE = 'Manhattan';</w:t>
+      </w:r>
+    </w:p>
+    <w:p>
+      <w:r>
+        <w:t>7) Co-actors (IN two-step) / 同片演員（IN兩步）</w:t>
+      </w:r>
+    </w:p>
+    <w:p>
+      <w:r>
+        <w:rPr>
+          <w:rFonts w:ascii="Consolas" w:hAnsi="Consolas"/>
+          <w:sz w:val="20"/>
+        </w:rPr>
+        <w:t>SELECT DISTINCT s2.STARNAME</w:t>
+        <w:br/>
+        <w:t>FROM star s2</w:t>
+        <w:br/>
+        <w:t>JOIN movstar ms2 ON ms2.STARNUMB = s2.STARNUMB</w:t>
+        <w:br/>
+        <w:t>WHERE ms2.MVNUMB IN (</w:t>
+        <w:br/>
+        <w:t xml:space="preserve">  SELECT ms1.MVNUMB</w:t>
+        <w:br/>
+        <w:t xml:space="preserve">  FROM star s1</w:t>
+        <w:br/>
+        <w:t xml:space="preserve">  JOIN movstar ms1 ON ms1.STARNUMB = s1.STARNUMB</w:t>
+        <w:br/>
+        <w:t xml:space="preserve">  WHERE s1.STARNAME LIKE '%Allen%' AND s1.STARNAME LIKE '%Woody%'</w:t>
+        <w:br/>
+        <w:t>)</w:t>
+        <w:br/>
+        <w:t>AND NOT (s2.STARNAME LIKE '%Allen%' AND s2.STARNAME LIKE '%Woody%');</w:t>
+      </w:r>
+    </w:p>
+    <w:p>
+      <w:r>
+        <w:br w:type="page"/>
       </w:r>
     </w:p>
     <w:p>

</xml_diff>